<commit_message>
Finalize contract: fill all placeholders in contract.docx
Gary provided the LLC mailing address and confirmed the company
signatory block. All template placeholders in the contract have
been substituted both in contract.docx (verified by re-extracting
the docx and grepping the text) and in contract.md.

Substitutions:
- §15 Choice of Law: Georgia
- §16 Venue: Fulton County, Georgia
- §25 Mailing address: 8735 Dunwoody Place, Ste R, Atlanta, GA 30350
- §25 Program email: affiliates@dreamgatesolutions.com (kept as-is;
  mailbox setup is still a pre-launch task)
- Company signature block: Printed Name = Gary Mitchell, Title =
  Managing Member. Signature line + Date left blank for one-time
  e-signature at the GHL Documents & Contracts template-upload step.

The contract.docx in the repo is now upload-ready for GHL Documents
& Contracts as a reusable template.
</commit_message>
<xml_diff>
--- a/funnels/04-broker-referral/contract.docx
+++ b/funnels/04-broker-referral/contract.docx
@@ -1382,7 +1382,7 @@
           <w:sz w:val="22"/>
           <w:szCs w:val="22"/>
         </w:rPr>
-        <w:t xml:space="preserve">This Agreement shall be governed by the laws of the State of [STATE], without regard to its conflict of laws rules or principles.</w:t>
+        <w:t xml:space="preserve">This Agreement shall be governed by the laws of the State of Georgia, without regard to its conflict of laws rules or principles.</w:t>
       </w:r>
     </w:p>
     <w:p>
@@ -1412,7 +1412,7 @@
           <w:sz w:val="22"/>
           <w:szCs w:val="22"/>
         </w:rPr>
-        <w:t xml:space="preserve">Affiliate hereby consents to exclusive jurisdiction and venue in the state and federal courts located in [COUNTY, STATE] for all proceedings arising out of this Agreement that are not subject to arbitration.</w:t>
+        <w:t xml:space="preserve">Affiliate hereby consents to exclusive jurisdiction and venue in the state and federal courts located in Fulton County, Georgia for all proceedings arising out of this Agreement that are not subject to arbitration.</w:t>
       </w:r>
     </w:p>
     <w:p>
@@ -1747,21 +1747,21 @@
           <w:sz w:val="22"/>
           <w:szCs w:val="22"/>
         </w:rPr>
-        <w:t xml:space="preserve">[Company Mailing Address]</w:t>
-      </w:r>
-    </w:p>
-    <w:p>
-      <w:pPr>
-        <w:spacing w:after="160" w:line="300"/>
-        <w:jc w:val="both"/>
-      </w:pPr>
-      <w:r>
-        <w:rPr>
-          <w:rFonts w:ascii="Arial" w:cs="Arial" w:eastAsia="Arial" w:hAnsi="Arial"/>
-          <w:sz w:val="22"/>
-          <w:szCs w:val="22"/>
-        </w:rPr>
-        <w:t xml:space="preserve">[City, State, ZIP]</w:t>
+        <w:t xml:space="preserve">8735 Dunwoody Place, Ste R</w:t>
+      </w:r>
+    </w:p>
+    <w:p>
+      <w:pPr>
+        <w:spacing w:after="160" w:line="300"/>
+        <w:jc w:val="both"/>
+      </w:pPr>
+      <w:r>
+        <w:rPr>
+          <w:rFonts w:ascii="Arial" w:cs="Arial" w:eastAsia="Arial" w:hAnsi="Arial"/>
+          <w:sz w:val="22"/>
+          <w:szCs w:val="22"/>
+        </w:rPr>
+        <w:t xml:space="preserve">Atlanta, GA 30350</w:t>
       </w:r>
     </w:p>
     <w:p>
@@ -1965,7 +1965,7 @@
           <w:sz w:val="22"/>
           <w:szCs w:val="22"/>
         </w:rPr>
-        <w:t xml:space="preserve">Printed Name: ______________________________</w:t>
+        <w:t xml:space="preserve">Printed Name: Gary Mitchell</w:t>
       </w:r>
     </w:p>
     <w:p>
@@ -1978,7 +1978,7 @@
           <w:sz w:val="22"/>
           <w:szCs w:val="22"/>
         </w:rPr>
-        <w:t xml:space="preserve">Title: ______________________________</w:t>
+        <w:t xml:space="preserve">Title: Managing Member</w:t>
       </w:r>
     </w:p>
     <w:p>

</xml_diff>